<commit_message>
Add Iteration 1 Sprint 1 documentation final
</commit_message>
<xml_diff>
--- a/docs/Iteration_1.docx
+++ b/docs/Iteration_1.docx
@@ -73,12 +73,6 @@
         <w:gridCol w:w="7200"/>
       </w:tblGrid>
       <w:tr>
-        <w:tblPrEx>
-          <w:tblCellMar>
-            <w:top w:w="0" w:type="dxa"/>
-            <w:bottom w:w="0" w:type="dxa"/>
-          </w:tblCellMar>
-        </w:tblPrEx>
         <w:tc>
           <w:tcPr>
             <w:tcW w:w="7200" w:type="dxa"/>
@@ -224,12 +218,6 @@
         <w:gridCol w:w="4656"/>
       </w:tblGrid>
       <w:tr>
-        <w:tblPrEx>
-          <w:tblCellMar>
-            <w:top w:w="0" w:type="dxa"/>
-            <w:bottom w:w="0" w:type="dxa"/>
-          </w:tblCellMar>
-        </w:tblPrEx>
         <w:trPr>
           <w:trHeight w:val="160"/>
         </w:trPr>
@@ -303,12 +291,6 @@
         </w:tc>
       </w:tr>
       <w:tr>
-        <w:tblPrEx>
-          <w:tblCellMar>
-            <w:top w:w="0" w:type="dxa"/>
-            <w:bottom w:w="0" w:type="dxa"/>
-          </w:tblCellMar>
-        </w:tblPrEx>
         <w:trPr>
           <w:trHeight w:val="160"/>
         </w:trPr>
@@ -375,12 +357,6 @@
         </w:tc>
       </w:tr>
       <w:tr>
-        <w:tblPrEx>
-          <w:tblCellMar>
-            <w:top w:w="0" w:type="dxa"/>
-            <w:bottom w:w="0" w:type="dxa"/>
-          </w:tblCellMar>
-        </w:tblPrEx>
         <w:trPr>
           <w:trHeight w:val="160"/>
         </w:trPr>
@@ -458,12 +434,6 @@
         </w:tc>
       </w:tr>
       <w:tr>
-        <w:tblPrEx>
-          <w:tblCellMar>
-            <w:top w:w="0" w:type="dxa"/>
-            <w:bottom w:w="0" w:type="dxa"/>
-          </w:tblCellMar>
-        </w:tblPrEx>
         <w:trPr>
           <w:trHeight w:val="152"/>
         </w:trPr>
@@ -884,12 +854,6 @@
         <w:gridCol w:w="6860"/>
       </w:tblGrid>
       <w:tr>
-        <w:tblPrEx>
-          <w:tblCellMar>
-            <w:top w:w="0" w:type="dxa"/>
-            <w:bottom w:w="0" w:type="dxa"/>
-          </w:tblCellMar>
-        </w:tblPrEx>
         <w:tc>
           <w:tcPr>
             <w:tcW w:w="2500" w:type="dxa"/>
@@ -960,12 +924,6 @@
         </w:tc>
       </w:tr>
       <w:tr>
-        <w:tblPrEx>
-          <w:tblCellMar>
-            <w:top w:w="0" w:type="dxa"/>
-            <w:bottom w:w="0" w:type="dxa"/>
-          </w:tblCellMar>
-        </w:tblPrEx>
         <w:tc>
           <w:tcPr>
             <w:tcW w:w="2500" w:type="dxa"/>
@@ -1024,12 +982,6 @@
         </w:tc>
       </w:tr>
       <w:tr>
-        <w:tblPrEx>
-          <w:tblCellMar>
-            <w:top w:w="0" w:type="dxa"/>
-            <w:bottom w:w="0" w:type="dxa"/>
-          </w:tblCellMar>
-        </w:tblPrEx>
         <w:tc>
           <w:tcPr>
             <w:tcW w:w="2500" w:type="dxa"/>
@@ -1088,12 +1040,6 @@
         </w:tc>
       </w:tr>
       <w:tr>
-        <w:tblPrEx>
-          <w:tblCellMar>
-            <w:top w:w="0" w:type="dxa"/>
-            <w:bottom w:w="0" w:type="dxa"/>
-          </w:tblCellMar>
-        </w:tblPrEx>
         <w:tc>
           <w:tcPr>
             <w:tcW w:w="2500" w:type="dxa"/>
@@ -1152,12 +1098,6 @@
         </w:tc>
       </w:tr>
       <w:tr>
-        <w:tblPrEx>
-          <w:tblCellMar>
-            <w:top w:w="0" w:type="dxa"/>
-            <w:bottom w:w="0" w:type="dxa"/>
-          </w:tblCellMar>
-        </w:tblPrEx>
         <w:tc>
           <w:tcPr>
             <w:tcW w:w="2500" w:type="dxa"/>
@@ -1216,12 +1156,6 @@
         </w:tc>
       </w:tr>
       <w:tr>
-        <w:tblPrEx>
-          <w:tblCellMar>
-            <w:top w:w="0" w:type="dxa"/>
-            <w:bottom w:w="0" w:type="dxa"/>
-          </w:tblCellMar>
-        </w:tblPrEx>
         <w:tc>
           <w:tcPr>
             <w:tcW w:w="2500" w:type="dxa"/>
@@ -1280,12 +1214,6 @@
         </w:tc>
       </w:tr>
       <w:tr>
-        <w:tblPrEx>
-          <w:tblCellMar>
-            <w:top w:w="0" w:type="dxa"/>
-            <w:bottom w:w="0" w:type="dxa"/>
-          </w:tblCellMar>
-        </w:tblPrEx>
         <w:tc>
           <w:tcPr>
             <w:tcW w:w="2500" w:type="dxa"/>
@@ -1344,12 +1272,6 @@
         </w:tc>
       </w:tr>
       <w:tr>
-        <w:tblPrEx>
-          <w:tblCellMar>
-            <w:top w:w="0" w:type="dxa"/>
-            <w:bottom w:w="0" w:type="dxa"/>
-          </w:tblCellMar>
-        </w:tblPrEx>
         <w:tc>
           <w:tcPr>
             <w:tcW w:w="2500" w:type="dxa"/>
@@ -1519,12 +1441,6 @@
         <w:gridCol w:w="2160"/>
       </w:tblGrid>
       <w:tr>
-        <w:tblPrEx>
-          <w:tblCellMar>
-            <w:top w:w="0" w:type="dxa"/>
-            <w:bottom w:w="0" w:type="dxa"/>
-          </w:tblCellMar>
-        </w:tblPrEx>
         <w:tc>
           <w:tcPr>
             <w:tcW w:w="7200" w:type="dxa"/>
@@ -1614,12 +1530,6 @@
         </w:tc>
       </w:tr>
       <w:tr>
-        <w:tblPrEx>
-          <w:tblCellMar>
-            <w:top w:w="0" w:type="dxa"/>
-            <w:bottom w:w="0" w:type="dxa"/>
-          </w:tblCellMar>
-        </w:tblPrEx>
         <w:tc>
           <w:tcPr>
             <w:tcW w:w="9360" w:type="dxa"/>
@@ -2028,12 +1938,6 @@
         <w:gridCol w:w="2160"/>
       </w:tblGrid>
       <w:tr>
-        <w:tblPrEx>
-          <w:tblCellMar>
-            <w:top w:w="0" w:type="dxa"/>
-            <w:bottom w:w="0" w:type="dxa"/>
-          </w:tblCellMar>
-        </w:tblPrEx>
         <w:tc>
           <w:tcPr>
             <w:tcW w:w="7200" w:type="dxa"/>
@@ -2123,12 +2027,6 @@
         </w:tc>
       </w:tr>
       <w:tr>
-        <w:tblPrEx>
-          <w:tblCellMar>
-            <w:top w:w="0" w:type="dxa"/>
-            <w:bottom w:w="0" w:type="dxa"/>
-          </w:tblCellMar>
-        </w:tblPrEx>
         <w:tc>
           <w:tcPr>
             <w:tcW w:w="9360" w:type="dxa"/>
@@ -2506,12 +2404,6 @@
         <w:gridCol w:w="2160"/>
       </w:tblGrid>
       <w:tr>
-        <w:tblPrEx>
-          <w:tblCellMar>
-            <w:top w:w="0" w:type="dxa"/>
-            <w:bottom w:w="0" w:type="dxa"/>
-          </w:tblCellMar>
-        </w:tblPrEx>
         <w:tc>
           <w:tcPr>
             <w:tcW w:w="7200" w:type="dxa"/>
@@ -2627,12 +2519,6 @@
         </w:tc>
       </w:tr>
       <w:tr>
-        <w:tblPrEx>
-          <w:tblCellMar>
-            <w:top w:w="0" w:type="dxa"/>
-            <w:bottom w:w="0" w:type="dxa"/>
-          </w:tblCellMar>
-        </w:tblPrEx>
         <w:tc>
           <w:tcPr>
             <w:tcW w:w="9360" w:type="dxa"/>
@@ -2975,12 +2861,6 @@
         <w:gridCol w:w="2160"/>
       </w:tblGrid>
       <w:tr>
-        <w:tblPrEx>
-          <w:tblCellMar>
-            <w:top w:w="0" w:type="dxa"/>
-            <w:bottom w:w="0" w:type="dxa"/>
-          </w:tblCellMar>
-        </w:tblPrEx>
         <w:tc>
           <w:tcPr>
             <w:tcW w:w="7200" w:type="dxa"/>
@@ -3079,12 +2959,6 @@
         </w:tc>
       </w:tr>
       <w:tr>
-        <w:tblPrEx>
-          <w:tblCellMar>
-            <w:top w:w="0" w:type="dxa"/>
-            <w:bottom w:w="0" w:type="dxa"/>
-          </w:tblCellMar>
-        </w:tblPrEx>
         <w:tc>
           <w:tcPr>
             <w:tcW w:w="9360" w:type="dxa"/>
@@ -3486,12 +3360,6 @@
         <w:gridCol w:w="6860"/>
       </w:tblGrid>
       <w:tr>
-        <w:tblPrEx>
-          <w:tblCellMar>
-            <w:top w:w="0" w:type="dxa"/>
-            <w:bottom w:w="0" w:type="dxa"/>
-          </w:tblCellMar>
-        </w:tblPrEx>
         <w:tc>
           <w:tcPr>
             <w:tcW w:w="9360" w:type="dxa"/>
@@ -3526,12 +3394,6 @@
         </w:tc>
       </w:tr>
       <w:tr>
-        <w:tblPrEx>
-          <w:tblCellMar>
-            <w:top w:w="0" w:type="dxa"/>
-            <w:bottom w:w="0" w:type="dxa"/>
-          </w:tblCellMar>
-        </w:tblPrEx>
         <w:tc>
           <w:tcPr>
             <w:tcW w:w="2500" w:type="dxa"/>
@@ -3592,12 +3454,6 @@
         </w:tc>
       </w:tr>
       <w:tr>
-        <w:tblPrEx>
-          <w:tblCellMar>
-            <w:top w:w="0" w:type="dxa"/>
-            <w:bottom w:w="0" w:type="dxa"/>
-          </w:tblCellMar>
-        </w:tblPrEx>
         <w:tc>
           <w:tcPr>
             <w:tcW w:w="2500" w:type="dxa"/>
@@ -3658,12 +3514,6 @@
         </w:tc>
       </w:tr>
       <w:tr>
-        <w:tblPrEx>
-          <w:tblCellMar>
-            <w:top w:w="0" w:type="dxa"/>
-            <w:bottom w:w="0" w:type="dxa"/>
-          </w:tblCellMar>
-        </w:tblPrEx>
         <w:tc>
           <w:tcPr>
             <w:tcW w:w="2500" w:type="dxa"/>
@@ -3724,12 +3574,6 @@
         </w:tc>
       </w:tr>
       <w:tr>
-        <w:tblPrEx>
-          <w:tblCellMar>
-            <w:top w:w="0" w:type="dxa"/>
-            <w:bottom w:w="0" w:type="dxa"/>
-          </w:tblCellMar>
-        </w:tblPrEx>
         <w:tc>
           <w:tcPr>
             <w:tcW w:w="2500" w:type="dxa"/>
@@ -3790,12 +3634,6 @@
         </w:tc>
       </w:tr>
       <w:tr>
-        <w:tblPrEx>
-          <w:tblCellMar>
-            <w:top w:w="0" w:type="dxa"/>
-            <w:bottom w:w="0" w:type="dxa"/>
-          </w:tblCellMar>
-        </w:tblPrEx>
         <w:tc>
           <w:tcPr>
             <w:tcW w:w="2500" w:type="dxa"/>
@@ -3856,12 +3694,6 @@
         </w:tc>
       </w:tr>
       <w:tr>
-        <w:tblPrEx>
-          <w:tblCellMar>
-            <w:top w:w="0" w:type="dxa"/>
-            <w:bottom w:w="0" w:type="dxa"/>
-          </w:tblCellMar>
-        </w:tblPrEx>
         <w:tc>
           <w:tcPr>
             <w:tcW w:w="2500" w:type="dxa"/>
@@ -3922,12 +3754,6 @@
         </w:tc>
       </w:tr>
       <w:tr>
-        <w:tblPrEx>
-          <w:tblCellMar>
-            <w:top w:w="0" w:type="dxa"/>
-            <w:bottom w:w="0" w:type="dxa"/>
-          </w:tblCellMar>
-        </w:tblPrEx>
         <w:tc>
           <w:tcPr>
             <w:tcW w:w="2500" w:type="dxa"/>
@@ -4140,12 +3966,6 @@
         </w:tc>
       </w:tr>
       <w:tr>
-        <w:tblPrEx>
-          <w:tblCellMar>
-            <w:top w:w="0" w:type="dxa"/>
-            <w:bottom w:w="0" w:type="dxa"/>
-          </w:tblCellMar>
-        </w:tblPrEx>
         <w:tc>
           <w:tcPr>
             <w:tcW w:w="2500" w:type="dxa"/>
@@ -4262,12 +4082,6 @@
         </w:tc>
       </w:tr>
       <w:tr>
-        <w:tblPrEx>
-          <w:tblCellMar>
-            <w:top w:w="0" w:type="dxa"/>
-            <w:bottom w:w="0" w:type="dxa"/>
-          </w:tblCellMar>
-        </w:tblPrEx>
         <w:tc>
           <w:tcPr>
             <w:tcW w:w="2500" w:type="dxa"/>
@@ -4412,12 +4226,6 @@
         <w:gridCol w:w="6860"/>
       </w:tblGrid>
       <w:tr>
-        <w:tblPrEx>
-          <w:tblCellMar>
-            <w:top w:w="0" w:type="dxa"/>
-            <w:bottom w:w="0" w:type="dxa"/>
-          </w:tblCellMar>
-        </w:tblPrEx>
         <w:tc>
           <w:tcPr>
             <w:tcW w:w="9360" w:type="dxa"/>
@@ -4452,12 +4260,6 @@
         </w:tc>
       </w:tr>
       <w:tr>
-        <w:tblPrEx>
-          <w:tblCellMar>
-            <w:top w:w="0" w:type="dxa"/>
-            <w:bottom w:w="0" w:type="dxa"/>
-          </w:tblCellMar>
-        </w:tblPrEx>
         <w:tc>
           <w:tcPr>
             <w:tcW w:w="2500" w:type="dxa"/>
@@ -4518,12 +4320,6 @@
         </w:tc>
       </w:tr>
       <w:tr>
-        <w:tblPrEx>
-          <w:tblCellMar>
-            <w:top w:w="0" w:type="dxa"/>
-            <w:bottom w:w="0" w:type="dxa"/>
-          </w:tblCellMar>
-        </w:tblPrEx>
         <w:tc>
           <w:tcPr>
             <w:tcW w:w="2500" w:type="dxa"/>
@@ -4584,12 +4380,6 @@
         </w:tc>
       </w:tr>
       <w:tr>
-        <w:tblPrEx>
-          <w:tblCellMar>
-            <w:top w:w="0" w:type="dxa"/>
-            <w:bottom w:w="0" w:type="dxa"/>
-          </w:tblCellMar>
-        </w:tblPrEx>
         <w:tc>
           <w:tcPr>
             <w:tcW w:w="2500" w:type="dxa"/>
@@ -4650,12 +4440,6 @@
         </w:tc>
       </w:tr>
       <w:tr>
-        <w:tblPrEx>
-          <w:tblCellMar>
-            <w:top w:w="0" w:type="dxa"/>
-            <w:bottom w:w="0" w:type="dxa"/>
-          </w:tblCellMar>
-        </w:tblPrEx>
         <w:tc>
           <w:tcPr>
             <w:tcW w:w="2500" w:type="dxa"/>
@@ -4716,12 +4500,6 @@
         </w:tc>
       </w:tr>
       <w:tr>
-        <w:tblPrEx>
-          <w:tblCellMar>
-            <w:top w:w="0" w:type="dxa"/>
-            <w:bottom w:w="0" w:type="dxa"/>
-          </w:tblCellMar>
-        </w:tblPrEx>
         <w:tc>
           <w:tcPr>
             <w:tcW w:w="2500" w:type="dxa"/>
@@ -4782,12 +4560,6 @@
         </w:tc>
       </w:tr>
       <w:tr>
-        <w:tblPrEx>
-          <w:tblCellMar>
-            <w:top w:w="0" w:type="dxa"/>
-            <w:bottom w:w="0" w:type="dxa"/>
-          </w:tblCellMar>
-        </w:tblPrEx>
         <w:tc>
           <w:tcPr>
             <w:tcW w:w="2500" w:type="dxa"/>
@@ -4848,12 +4620,6 @@
         </w:tc>
       </w:tr>
       <w:tr>
-        <w:tblPrEx>
-          <w:tblCellMar>
-            <w:top w:w="0" w:type="dxa"/>
-            <w:bottom w:w="0" w:type="dxa"/>
-          </w:tblCellMar>
-        </w:tblPrEx>
         <w:tc>
           <w:tcPr>
             <w:tcW w:w="2500" w:type="dxa"/>
@@ -5176,12 +4942,6 @@
         </w:tc>
       </w:tr>
       <w:tr>
-        <w:tblPrEx>
-          <w:tblCellMar>
-            <w:top w:w="0" w:type="dxa"/>
-            <w:bottom w:w="0" w:type="dxa"/>
-          </w:tblCellMar>
-        </w:tblPrEx>
         <w:tc>
           <w:tcPr>
             <w:tcW w:w="2500" w:type="dxa"/>
@@ -5316,12 +5076,6 @@
         </w:tc>
       </w:tr>
       <w:tr>
-        <w:tblPrEx>
-          <w:tblCellMar>
-            <w:top w:w="0" w:type="dxa"/>
-            <w:bottom w:w="0" w:type="dxa"/>
-          </w:tblCellMar>
-        </w:tblPrEx>
         <w:tc>
           <w:tcPr>
             <w:tcW w:w="2500" w:type="dxa"/>
@@ -5441,12 +5195,6 @@
         <w:gridCol w:w="6860"/>
       </w:tblGrid>
       <w:tr>
-        <w:tblPrEx>
-          <w:tblCellMar>
-            <w:top w:w="0" w:type="dxa"/>
-            <w:bottom w:w="0" w:type="dxa"/>
-          </w:tblCellMar>
-        </w:tblPrEx>
         <w:tc>
           <w:tcPr>
             <w:tcW w:w="9360" w:type="dxa"/>
@@ -5481,12 +5229,6 @@
         </w:tc>
       </w:tr>
       <w:tr>
-        <w:tblPrEx>
-          <w:tblCellMar>
-            <w:top w:w="0" w:type="dxa"/>
-            <w:bottom w:w="0" w:type="dxa"/>
-          </w:tblCellMar>
-        </w:tblPrEx>
         <w:tc>
           <w:tcPr>
             <w:tcW w:w="2500" w:type="dxa"/>
@@ -5547,12 +5289,6 @@
         </w:tc>
       </w:tr>
       <w:tr>
-        <w:tblPrEx>
-          <w:tblCellMar>
-            <w:top w:w="0" w:type="dxa"/>
-            <w:bottom w:w="0" w:type="dxa"/>
-          </w:tblCellMar>
-        </w:tblPrEx>
         <w:tc>
           <w:tcPr>
             <w:tcW w:w="2500" w:type="dxa"/>
@@ -5614,12 +5350,6 @@
         </w:tc>
       </w:tr>
       <w:tr>
-        <w:tblPrEx>
-          <w:tblCellMar>
-            <w:top w:w="0" w:type="dxa"/>
-            <w:bottom w:w="0" w:type="dxa"/>
-          </w:tblCellMar>
-        </w:tblPrEx>
         <w:tc>
           <w:tcPr>
             <w:tcW w:w="2500" w:type="dxa"/>
@@ -5680,12 +5410,6 @@
         </w:tc>
       </w:tr>
       <w:tr>
-        <w:tblPrEx>
-          <w:tblCellMar>
-            <w:top w:w="0" w:type="dxa"/>
-            <w:bottom w:w="0" w:type="dxa"/>
-          </w:tblCellMar>
-        </w:tblPrEx>
         <w:tc>
           <w:tcPr>
             <w:tcW w:w="2500" w:type="dxa"/>
@@ -5746,12 +5470,6 @@
         </w:tc>
       </w:tr>
       <w:tr>
-        <w:tblPrEx>
-          <w:tblCellMar>
-            <w:top w:w="0" w:type="dxa"/>
-            <w:bottom w:w="0" w:type="dxa"/>
-          </w:tblCellMar>
-        </w:tblPrEx>
         <w:tc>
           <w:tcPr>
             <w:tcW w:w="2500" w:type="dxa"/>
@@ -5812,12 +5530,6 @@
         </w:tc>
       </w:tr>
       <w:tr>
-        <w:tblPrEx>
-          <w:tblCellMar>
-            <w:top w:w="0" w:type="dxa"/>
-            <w:bottom w:w="0" w:type="dxa"/>
-          </w:tblCellMar>
-        </w:tblPrEx>
         <w:tc>
           <w:tcPr>
             <w:tcW w:w="2500" w:type="dxa"/>
@@ -5878,12 +5590,6 @@
         </w:tc>
       </w:tr>
       <w:tr>
-        <w:tblPrEx>
-          <w:tblCellMar>
-            <w:top w:w="0" w:type="dxa"/>
-            <w:bottom w:w="0" w:type="dxa"/>
-          </w:tblCellMar>
-        </w:tblPrEx>
         <w:tc>
           <w:tcPr>
             <w:tcW w:w="2500" w:type="dxa"/>
@@ -6253,12 +5959,6 @@
         </w:tc>
       </w:tr>
       <w:tr>
-        <w:tblPrEx>
-          <w:tblCellMar>
-            <w:top w:w="0" w:type="dxa"/>
-            <w:bottom w:w="0" w:type="dxa"/>
-          </w:tblCellMar>
-        </w:tblPrEx>
         <w:tc>
           <w:tcPr>
             <w:tcW w:w="2500" w:type="dxa"/>
@@ -6473,12 +6173,6 @@
         </w:tc>
       </w:tr>
       <w:tr>
-        <w:tblPrEx>
-          <w:tblCellMar>
-            <w:top w:w="0" w:type="dxa"/>
-            <w:bottom w:w="0" w:type="dxa"/>
-          </w:tblCellMar>
-        </w:tblPrEx>
         <w:tc>
           <w:tcPr>
             <w:tcW w:w="2500" w:type="dxa"/>
@@ -6566,12 +6260,6 @@
         <w:gridCol w:w="6860"/>
       </w:tblGrid>
       <w:tr>
-        <w:tblPrEx>
-          <w:tblCellMar>
-            <w:top w:w="0" w:type="dxa"/>
-            <w:bottom w:w="0" w:type="dxa"/>
-          </w:tblCellMar>
-        </w:tblPrEx>
         <w:tc>
           <w:tcPr>
             <w:tcW w:w="9360" w:type="dxa"/>
@@ -6606,12 +6294,6 @@
         </w:tc>
       </w:tr>
       <w:tr>
-        <w:tblPrEx>
-          <w:tblCellMar>
-            <w:top w:w="0" w:type="dxa"/>
-            <w:bottom w:w="0" w:type="dxa"/>
-          </w:tblCellMar>
-        </w:tblPrEx>
         <w:tc>
           <w:tcPr>
             <w:tcW w:w="2500" w:type="dxa"/>
@@ -6672,12 +6354,6 @@
         </w:tc>
       </w:tr>
       <w:tr>
-        <w:tblPrEx>
-          <w:tblCellMar>
-            <w:top w:w="0" w:type="dxa"/>
-            <w:bottom w:w="0" w:type="dxa"/>
-          </w:tblCellMar>
-        </w:tblPrEx>
         <w:tc>
           <w:tcPr>
             <w:tcW w:w="2500" w:type="dxa"/>
@@ -6738,12 +6414,6 @@
         </w:tc>
       </w:tr>
       <w:tr>
-        <w:tblPrEx>
-          <w:tblCellMar>
-            <w:top w:w="0" w:type="dxa"/>
-            <w:bottom w:w="0" w:type="dxa"/>
-          </w:tblCellMar>
-        </w:tblPrEx>
         <w:tc>
           <w:tcPr>
             <w:tcW w:w="2500" w:type="dxa"/>
@@ -6804,12 +6474,6 @@
         </w:tc>
       </w:tr>
       <w:tr>
-        <w:tblPrEx>
-          <w:tblCellMar>
-            <w:top w:w="0" w:type="dxa"/>
-            <w:bottom w:w="0" w:type="dxa"/>
-          </w:tblCellMar>
-        </w:tblPrEx>
         <w:tc>
           <w:tcPr>
             <w:tcW w:w="2500" w:type="dxa"/>
@@ -6870,12 +6534,6 @@
         </w:tc>
       </w:tr>
       <w:tr>
-        <w:tblPrEx>
-          <w:tblCellMar>
-            <w:top w:w="0" w:type="dxa"/>
-            <w:bottom w:w="0" w:type="dxa"/>
-          </w:tblCellMar>
-        </w:tblPrEx>
         <w:tc>
           <w:tcPr>
             <w:tcW w:w="2500" w:type="dxa"/>
@@ -6936,12 +6594,6 @@
         </w:tc>
       </w:tr>
       <w:tr>
-        <w:tblPrEx>
-          <w:tblCellMar>
-            <w:top w:w="0" w:type="dxa"/>
-            <w:bottom w:w="0" w:type="dxa"/>
-          </w:tblCellMar>
-        </w:tblPrEx>
         <w:tc>
           <w:tcPr>
             <w:tcW w:w="2500" w:type="dxa"/>
@@ -7019,12 +6671,6 @@
         </w:tc>
       </w:tr>
       <w:tr>
-        <w:tblPrEx>
-          <w:tblCellMar>
-            <w:top w:w="0" w:type="dxa"/>
-            <w:bottom w:w="0" w:type="dxa"/>
-          </w:tblCellMar>
-        </w:tblPrEx>
         <w:tc>
           <w:tcPr>
             <w:tcW w:w="2500" w:type="dxa"/>
@@ -7267,12 +6913,6 @@
         </w:tc>
       </w:tr>
       <w:tr>
-        <w:tblPrEx>
-          <w:tblCellMar>
-            <w:top w:w="0" w:type="dxa"/>
-            <w:bottom w:w="0" w:type="dxa"/>
-          </w:tblCellMar>
-        </w:tblPrEx>
         <w:tc>
           <w:tcPr>
             <w:tcW w:w="2500" w:type="dxa"/>
@@ -7421,12 +7061,6 @@
         </w:tc>
       </w:tr>
       <w:tr>
-        <w:tblPrEx>
-          <w:tblCellMar>
-            <w:top w:w="0" w:type="dxa"/>
-            <w:bottom w:w="0" w:type="dxa"/>
-          </w:tblCellMar>
-        </w:tblPrEx>
         <w:tc>
           <w:tcPr>
             <w:tcW w:w="2500" w:type="dxa"/>
@@ -7519,12 +7153,6 @@
         </w:tc>
       </w:tr>
       <w:tr>
-        <w:tblPrEx>
-          <w:tblCellMar>
-            <w:top w:w="0" w:type="dxa"/>
-            <w:bottom w:w="0" w:type="dxa"/>
-          </w:tblCellMar>
-        </w:tblPrEx>
         <w:tc>
           <w:tcPr>
             <w:tcW w:w="2500" w:type="dxa"/>
@@ -7668,6 +7296,9 @@
         <w:spacing w:before="80"/>
       </w:pPr>
       <w:r>
+        <w:rPr>
+          <w:noProof/>
+        </w:rPr>
         <w:drawing>
           <wp:inline distT="0" distB="0" distL="0" distR="0" wp14:anchorId="2E84D85A" wp14:editId="0309BDDC">
             <wp:extent cx="6400800" cy="2181225"/>
@@ -7761,6 +7392,7 @@
         <w:rPr>
           <w:i/>
           <w:iCs/>
+          <w:noProof/>
         </w:rPr>
         <w:drawing>
           <wp:inline distT="0" distB="0" distL="0" distR="0" wp14:anchorId="19300273" wp14:editId="67B34A86">
@@ -7843,6 +7475,7 @@
         <w:rPr>
           <w:i/>
           <w:iCs/>
+          <w:noProof/>
         </w:rPr>
         <w:lastRenderedPageBreak/>
         <w:drawing>
@@ -7928,10 +7561,10 @@
           <w:noProof/>
         </w:rPr>
         <w:drawing>
-          <wp:inline distT="0" distB="0" distL="0" distR="0" wp14:anchorId="002C0DDD" wp14:editId="351C8E6F">
-            <wp:extent cx="5905500" cy="3248025"/>
-            <wp:effectExtent l="0" t="0" r="0" b="0"/>
-            <wp:docPr id="1" name="BurndownChart" descr="Planned vs actual task completion" title="Sprint 1 Burndown Chart"/>
+          <wp:inline distT="0" distB="0" distL="0" distR="0" wp14:anchorId="4FDA575A" wp14:editId="5A55A7D5">
+            <wp:extent cx="6400800" cy="4053205"/>
+            <wp:effectExtent l="0" t="0" r="0" b="4445"/>
+            <wp:docPr id="765704865" name="Picture 1"/>
             <wp:cNvGraphicFramePr>
               <a:graphicFrameLocks xmlns:a="http://schemas.openxmlformats.org/drawingml/2006/main" noChangeAspect="1"/>
             </wp:cNvGraphicFramePr>
@@ -7939,22 +7572,19 @@
               <a:graphicData uri="http://schemas.openxmlformats.org/drawingml/2006/picture">
                 <pic:pic xmlns:pic="http://schemas.openxmlformats.org/drawingml/2006/picture">
                   <pic:nvPicPr>
-                    <pic:cNvPr id="0" name=""/>
-                    <pic:cNvPicPr>
-                      <a:picLocks noChangeAspect="1" noChangeArrowheads="1"/>
-                    </pic:cNvPicPr>
+                    <pic:cNvPr id="765704865" name=""/>
+                    <pic:cNvPicPr/>
                   </pic:nvPicPr>
                   <pic:blipFill>
                     <a:blip r:embed="rId10"/>
-                    <a:srcRect/>
                     <a:stretch>
                       <a:fillRect/>
                     </a:stretch>
                   </pic:blipFill>
-                  <pic:spPr bwMode="auto">
+                  <pic:spPr>
                     <a:xfrm>
                       <a:off x="0" y="0"/>
-                      <a:ext cx="5905500" cy="3248025"/>
+                      <a:ext cx="6400800" cy="4053205"/>
                     </a:xfrm>
                     <a:prstGeom prst="rect">
                       <a:avLst/>
@@ -8034,12 +7664,6 @@
         <w:gridCol w:w="6192"/>
       </w:tblGrid>
       <w:tr>
-        <w:tblPrEx>
-          <w:tblCellMar>
-            <w:top w:w="0" w:type="dxa"/>
-            <w:bottom w:w="0" w:type="dxa"/>
-          </w:tblCellMar>
-        </w:tblPrEx>
         <w:tc>
           <w:tcPr>
             <w:tcW w:w="798" w:type="dxa"/>
@@ -8144,12 +7768,6 @@
         </w:tc>
       </w:tr>
       <w:tr>
-        <w:tblPrEx>
-          <w:tblCellMar>
-            <w:top w:w="0" w:type="dxa"/>
-            <w:bottom w:w="0" w:type="dxa"/>
-          </w:tblCellMar>
-        </w:tblPrEx>
         <w:tc>
           <w:tcPr>
             <w:tcW w:w="798" w:type="dxa"/>
@@ -8263,12 +7881,6 @@
         </w:tc>
       </w:tr>
       <w:tr>
-        <w:tblPrEx>
-          <w:tblCellMar>
-            <w:top w:w="0" w:type="dxa"/>
-            <w:bottom w:w="0" w:type="dxa"/>
-          </w:tblCellMar>
-        </w:tblPrEx>
         <w:tc>
           <w:tcPr>
             <w:tcW w:w="798" w:type="dxa"/>
@@ -8366,12 +7978,6 @@
         </w:tc>
       </w:tr>
       <w:tr>
-        <w:tblPrEx>
-          <w:tblCellMar>
-            <w:top w:w="0" w:type="dxa"/>
-            <w:bottom w:w="0" w:type="dxa"/>
-          </w:tblCellMar>
-        </w:tblPrEx>
         <w:tc>
           <w:tcPr>
             <w:tcW w:w="798" w:type="dxa"/>
@@ -8526,12 +8132,6 @@
         </w:tc>
       </w:tr>
       <w:tr>
-        <w:tblPrEx>
-          <w:tblCellMar>
-            <w:top w:w="0" w:type="dxa"/>
-            <w:bottom w:w="0" w:type="dxa"/>
-          </w:tblCellMar>
-        </w:tblPrEx>
         <w:tc>
           <w:tcPr>
             <w:tcW w:w="798" w:type="dxa"/>
@@ -8629,12 +8229,6 @@
         </w:tc>
       </w:tr>
       <w:tr>
-        <w:tblPrEx>
-          <w:tblCellMar>
-            <w:top w:w="0" w:type="dxa"/>
-            <w:bottom w:w="0" w:type="dxa"/>
-          </w:tblCellMar>
-        </w:tblPrEx>
         <w:tc>
           <w:tcPr>
             <w:tcW w:w="798" w:type="dxa"/>
@@ -8732,12 +8326,6 @@
         </w:tc>
       </w:tr>
       <w:tr>
-        <w:tblPrEx>
-          <w:tblCellMar>
-            <w:top w:w="0" w:type="dxa"/>
-            <w:bottom w:w="0" w:type="dxa"/>
-          </w:tblCellMar>
-        </w:tblPrEx>
         <w:tc>
           <w:tcPr>
             <w:tcW w:w="798" w:type="dxa"/>
@@ -8835,12 +8423,6 @@
         </w:tc>
       </w:tr>
       <w:tr>
-        <w:tblPrEx>
-          <w:tblCellMar>
-            <w:top w:w="0" w:type="dxa"/>
-            <w:bottom w:w="0" w:type="dxa"/>
-          </w:tblCellMar>
-        </w:tblPrEx>
         <w:tc>
           <w:tcPr>
             <w:tcW w:w="798" w:type="dxa"/>
@@ -9161,7 +8743,7 @@
         </w:rPr>
         <w:lastRenderedPageBreak/>
         <w:drawing>
-          <wp:inline distT="0" distB="0" distL="0" distR="0" wp14:anchorId="391AC5D1" wp14:editId="305674D8">
+          <wp:inline distT="0" distB="0" distL="0" distR="0" wp14:anchorId="391AC5D1" wp14:editId="2D8E114C">
             <wp:extent cx="6400800" cy="3703955"/>
             <wp:effectExtent l="0" t="0" r="0" b="0"/>
             <wp:docPr id="533701768" name="Picture 3"/>
@@ -9316,7 +8898,7 @@
         </w:rPr>
         <w:lastRenderedPageBreak/>
         <w:drawing>
-          <wp:inline distT="0" distB="0" distL="0" distR="0" wp14:anchorId="2F870B39" wp14:editId="51E74532">
+          <wp:inline distT="0" distB="0" distL="0" distR="0" wp14:anchorId="2F870B39" wp14:editId="1DD5C909">
             <wp:extent cx="6400800" cy="3093720"/>
             <wp:effectExtent l="0" t="0" r="0" b="0"/>
             <wp:docPr id="1919743656" name="Picture 5"/>
@@ -9380,10 +8962,10 @@
       </w:pPr>
       <w:r>
         <w:drawing>
-          <wp:inline distT="0" distB="0" distL="0" distR="0" wp14:anchorId="31E91F9B" wp14:editId="166F9657">
-            <wp:extent cx="6400800" cy="3101975"/>
-            <wp:effectExtent l="0" t="0" r="0" b="3175"/>
-            <wp:docPr id="1537686657" name="Picture 1"/>
+          <wp:inline distT="0" distB="0" distL="0" distR="0" wp14:anchorId="1579E158" wp14:editId="33C638FA">
+            <wp:extent cx="6400800" cy="3025140"/>
+            <wp:effectExtent l="0" t="0" r="0" b="3810"/>
+            <wp:docPr id="1210935151" name="Picture 1"/>
             <wp:cNvGraphicFramePr>
               <a:graphicFrameLocks xmlns:a="http://schemas.openxmlformats.org/drawingml/2006/main" noChangeAspect="1"/>
             </wp:cNvGraphicFramePr>
@@ -9391,7 +8973,7 @@
               <a:graphicData uri="http://schemas.openxmlformats.org/drawingml/2006/picture">
                 <pic:pic xmlns:pic="http://schemas.openxmlformats.org/drawingml/2006/picture">
                   <pic:nvPicPr>
-                    <pic:cNvPr id="1537686657" name=""/>
+                    <pic:cNvPr id="1210935151" name=""/>
                     <pic:cNvPicPr/>
                   </pic:nvPicPr>
                   <pic:blipFill>
@@ -9403,7 +8985,7 @@
                   <pic:spPr>
                     <a:xfrm>
                       <a:off x="0" y="0"/>
-                      <a:ext cx="6400800" cy="3101975"/>
+                      <a:ext cx="6400800" cy="3025140"/>
                     </a:xfrm>
                     <a:prstGeom prst="rect">
                       <a:avLst/>
@@ -10137,6 +9719,7 @@
   <w:style w:type="character" w:default="1" w:styleId="DefaultParagraphFont">
     <w:name w:val="Default Paragraph Font"/>
     <w:uiPriority w:val="1"/>
+    <w:semiHidden/>
     <w:unhideWhenUsed/>
   </w:style>
   <w:style w:type="table" w:default="1" w:styleId="TableNormal">

</xml_diff>

<commit_message>
frontend things of sprint 2 (VideoUploader, ResultsPanel, and TranslationService)
</commit_message>
<xml_diff>
--- a/docs/Iteration_1.docx
+++ b/docs/Iteration_1.docx
@@ -73,12 +73,6 @@
         <w:gridCol w:w="7200"/>
       </w:tblGrid>
       <w:tr>
-        <w:tblPrEx>
-          <w:tblCellMar>
-            <w:top w:w="0" w:type="dxa"/>
-            <w:bottom w:w="0" w:type="dxa"/>
-          </w:tblCellMar>
-        </w:tblPrEx>
         <w:tc>
           <w:tcPr>
             <w:tcW w:w="7200" w:type="dxa"/>
@@ -224,12 +218,6 @@
         <w:gridCol w:w="4656"/>
       </w:tblGrid>
       <w:tr>
-        <w:tblPrEx>
-          <w:tblCellMar>
-            <w:top w:w="0" w:type="dxa"/>
-            <w:bottom w:w="0" w:type="dxa"/>
-          </w:tblCellMar>
-        </w:tblPrEx>
         <w:trPr>
           <w:trHeight w:val="160"/>
         </w:trPr>
@@ -303,12 +291,6 @@
         </w:tc>
       </w:tr>
       <w:tr>
-        <w:tblPrEx>
-          <w:tblCellMar>
-            <w:top w:w="0" w:type="dxa"/>
-            <w:bottom w:w="0" w:type="dxa"/>
-          </w:tblCellMar>
-        </w:tblPrEx>
         <w:trPr>
           <w:trHeight w:val="160"/>
         </w:trPr>
@@ -375,12 +357,6 @@
         </w:tc>
       </w:tr>
       <w:tr>
-        <w:tblPrEx>
-          <w:tblCellMar>
-            <w:top w:w="0" w:type="dxa"/>
-            <w:bottom w:w="0" w:type="dxa"/>
-          </w:tblCellMar>
-        </w:tblPrEx>
         <w:trPr>
           <w:trHeight w:val="160"/>
         </w:trPr>
@@ -458,12 +434,6 @@
         </w:tc>
       </w:tr>
       <w:tr>
-        <w:tblPrEx>
-          <w:tblCellMar>
-            <w:top w:w="0" w:type="dxa"/>
-            <w:bottom w:w="0" w:type="dxa"/>
-          </w:tblCellMar>
-        </w:tblPrEx>
         <w:trPr>
           <w:trHeight w:val="152"/>
         </w:trPr>
@@ -884,12 +854,6 @@
         <w:gridCol w:w="6860"/>
       </w:tblGrid>
       <w:tr>
-        <w:tblPrEx>
-          <w:tblCellMar>
-            <w:top w:w="0" w:type="dxa"/>
-            <w:bottom w:w="0" w:type="dxa"/>
-          </w:tblCellMar>
-        </w:tblPrEx>
         <w:tc>
           <w:tcPr>
             <w:tcW w:w="2500" w:type="dxa"/>
@@ -960,12 +924,6 @@
         </w:tc>
       </w:tr>
       <w:tr>
-        <w:tblPrEx>
-          <w:tblCellMar>
-            <w:top w:w="0" w:type="dxa"/>
-            <w:bottom w:w="0" w:type="dxa"/>
-          </w:tblCellMar>
-        </w:tblPrEx>
         <w:tc>
           <w:tcPr>
             <w:tcW w:w="2500" w:type="dxa"/>
@@ -1024,12 +982,6 @@
         </w:tc>
       </w:tr>
       <w:tr>
-        <w:tblPrEx>
-          <w:tblCellMar>
-            <w:top w:w="0" w:type="dxa"/>
-            <w:bottom w:w="0" w:type="dxa"/>
-          </w:tblCellMar>
-        </w:tblPrEx>
         <w:tc>
           <w:tcPr>
             <w:tcW w:w="2500" w:type="dxa"/>
@@ -1088,12 +1040,6 @@
         </w:tc>
       </w:tr>
       <w:tr>
-        <w:tblPrEx>
-          <w:tblCellMar>
-            <w:top w:w="0" w:type="dxa"/>
-            <w:bottom w:w="0" w:type="dxa"/>
-          </w:tblCellMar>
-        </w:tblPrEx>
         <w:tc>
           <w:tcPr>
             <w:tcW w:w="2500" w:type="dxa"/>
@@ -1152,12 +1098,6 @@
         </w:tc>
       </w:tr>
       <w:tr>
-        <w:tblPrEx>
-          <w:tblCellMar>
-            <w:top w:w="0" w:type="dxa"/>
-            <w:bottom w:w="0" w:type="dxa"/>
-          </w:tblCellMar>
-        </w:tblPrEx>
         <w:tc>
           <w:tcPr>
             <w:tcW w:w="2500" w:type="dxa"/>
@@ -1216,12 +1156,6 @@
         </w:tc>
       </w:tr>
       <w:tr>
-        <w:tblPrEx>
-          <w:tblCellMar>
-            <w:top w:w="0" w:type="dxa"/>
-            <w:bottom w:w="0" w:type="dxa"/>
-          </w:tblCellMar>
-        </w:tblPrEx>
         <w:tc>
           <w:tcPr>
             <w:tcW w:w="2500" w:type="dxa"/>
@@ -1280,12 +1214,6 @@
         </w:tc>
       </w:tr>
       <w:tr>
-        <w:tblPrEx>
-          <w:tblCellMar>
-            <w:top w:w="0" w:type="dxa"/>
-            <w:bottom w:w="0" w:type="dxa"/>
-          </w:tblCellMar>
-        </w:tblPrEx>
         <w:tc>
           <w:tcPr>
             <w:tcW w:w="2500" w:type="dxa"/>
@@ -1344,12 +1272,6 @@
         </w:tc>
       </w:tr>
       <w:tr>
-        <w:tblPrEx>
-          <w:tblCellMar>
-            <w:top w:w="0" w:type="dxa"/>
-            <w:bottom w:w="0" w:type="dxa"/>
-          </w:tblCellMar>
-        </w:tblPrEx>
         <w:tc>
           <w:tcPr>
             <w:tcW w:w="2500" w:type="dxa"/>
@@ -1519,12 +1441,6 @@
         <w:gridCol w:w="2160"/>
       </w:tblGrid>
       <w:tr>
-        <w:tblPrEx>
-          <w:tblCellMar>
-            <w:top w:w="0" w:type="dxa"/>
-            <w:bottom w:w="0" w:type="dxa"/>
-          </w:tblCellMar>
-        </w:tblPrEx>
         <w:tc>
           <w:tcPr>
             <w:tcW w:w="7200" w:type="dxa"/>
@@ -1614,12 +1530,6 @@
         </w:tc>
       </w:tr>
       <w:tr>
-        <w:tblPrEx>
-          <w:tblCellMar>
-            <w:top w:w="0" w:type="dxa"/>
-            <w:bottom w:w="0" w:type="dxa"/>
-          </w:tblCellMar>
-        </w:tblPrEx>
         <w:tc>
           <w:tcPr>
             <w:tcW w:w="9360" w:type="dxa"/>
@@ -2028,12 +1938,6 @@
         <w:gridCol w:w="2160"/>
       </w:tblGrid>
       <w:tr>
-        <w:tblPrEx>
-          <w:tblCellMar>
-            <w:top w:w="0" w:type="dxa"/>
-            <w:bottom w:w="0" w:type="dxa"/>
-          </w:tblCellMar>
-        </w:tblPrEx>
         <w:tc>
           <w:tcPr>
             <w:tcW w:w="7200" w:type="dxa"/>
@@ -2123,12 +2027,6 @@
         </w:tc>
       </w:tr>
       <w:tr>
-        <w:tblPrEx>
-          <w:tblCellMar>
-            <w:top w:w="0" w:type="dxa"/>
-            <w:bottom w:w="0" w:type="dxa"/>
-          </w:tblCellMar>
-        </w:tblPrEx>
         <w:tc>
           <w:tcPr>
             <w:tcW w:w="9360" w:type="dxa"/>
@@ -2506,12 +2404,6 @@
         <w:gridCol w:w="2160"/>
       </w:tblGrid>
       <w:tr>
-        <w:tblPrEx>
-          <w:tblCellMar>
-            <w:top w:w="0" w:type="dxa"/>
-            <w:bottom w:w="0" w:type="dxa"/>
-          </w:tblCellMar>
-        </w:tblPrEx>
         <w:tc>
           <w:tcPr>
             <w:tcW w:w="7200" w:type="dxa"/>
@@ -2627,12 +2519,6 @@
         </w:tc>
       </w:tr>
       <w:tr>
-        <w:tblPrEx>
-          <w:tblCellMar>
-            <w:top w:w="0" w:type="dxa"/>
-            <w:bottom w:w="0" w:type="dxa"/>
-          </w:tblCellMar>
-        </w:tblPrEx>
         <w:tc>
           <w:tcPr>
             <w:tcW w:w="9360" w:type="dxa"/>
@@ -2975,12 +2861,6 @@
         <w:gridCol w:w="2160"/>
       </w:tblGrid>
       <w:tr>
-        <w:tblPrEx>
-          <w:tblCellMar>
-            <w:top w:w="0" w:type="dxa"/>
-            <w:bottom w:w="0" w:type="dxa"/>
-          </w:tblCellMar>
-        </w:tblPrEx>
         <w:tc>
           <w:tcPr>
             <w:tcW w:w="7200" w:type="dxa"/>
@@ -3079,12 +2959,6 @@
         </w:tc>
       </w:tr>
       <w:tr>
-        <w:tblPrEx>
-          <w:tblCellMar>
-            <w:top w:w="0" w:type="dxa"/>
-            <w:bottom w:w="0" w:type="dxa"/>
-          </w:tblCellMar>
-        </w:tblPrEx>
         <w:tc>
           <w:tcPr>
             <w:tcW w:w="9360" w:type="dxa"/>
@@ -3486,12 +3360,6 @@
         <w:gridCol w:w="6860"/>
       </w:tblGrid>
       <w:tr>
-        <w:tblPrEx>
-          <w:tblCellMar>
-            <w:top w:w="0" w:type="dxa"/>
-            <w:bottom w:w="0" w:type="dxa"/>
-          </w:tblCellMar>
-        </w:tblPrEx>
         <w:tc>
           <w:tcPr>
             <w:tcW w:w="9360" w:type="dxa"/>
@@ -3526,12 +3394,6 @@
         </w:tc>
       </w:tr>
       <w:tr>
-        <w:tblPrEx>
-          <w:tblCellMar>
-            <w:top w:w="0" w:type="dxa"/>
-            <w:bottom w:w="0" w:type="dxa"/>
-          </w:tblCellMar>
-        </w:tblPrEx>
         <w:tc>
           <w:tcPr>
             <w:tcW w:w="2500" w:type="dxa"/>
@@ -3592,12 +3454,6 @@
         </w:tc>
       </w:tr>
       <w:tr>
-        <w:tblPrEx>
-          <w:tblCellMar>
-            <w:top w:w="0" w:type="dxa"/>
-            <w:bottom w:w="0" w:type="dxa"/>
-          </w:tblCellMar>
-        </w:tblPrEx>
         <w:tc>
           <w:tcPr>
             <w:tcW w:w="2500" w:type="dxa"/>
@@ -3658,12 +3514,6 @@
         </w:tc>
       </w:tr>
       <w:tr>
-        <w:tblPrEx>
-          <w:tblCellMar>
-            <w:top w:w="0" w:type="dxa"/>
-            <w:bottom w:w="0" w:type="dxa"/>
-          </w:tblCellMar>
-        </w:tblPrEx>
         <w:tc>
           <w:tcPr>
             <w:tcW w:w="2500" w:type="dxa"/>
@@ -3724,12 +3574,6 @@
         </w:tc>
       </w:tr>
       <w:tr>
-        <w:tblPrEx>
-          <w:tblCellMar>
-            <w:top w:w="0" w:type="dxa"/>
-            <w:bottom w:w="0" w:type="dxa"/>
-          </w:tblCellMar>
-        </w:tblPrEx>
         <w:tc>
           <w:tcPr>
             <w:tcW w:w="2500" w:type="dxa"/>
@@ -3790,12 +3634,6 @@
         </w:tc>
       </w:tr>
       <w:tr>
-        <w:tblPrEx>
-          <w:tblCellMar>
-            <w:top w:w="0" w:type="dxa"/>
-            <w:bottom w:w="0" w:type="dxa"/>
-          </w:tblCellMar>
-        </w:tblPrEx>
         <w:tc>
           <w:tcPr>
             <w:tcW w:w="2500" w:type="dxa"/>
@@ -3856,12 +3694,6 @@
         </w:tc>
       </w:tr>
       <w:tr>
-        <w:tblPrEx>
-          <w:tblCellMar>
-            <w:top w:w="0" w:type="dxa"/>
-            <w:bottom w:w="0" w:type="dxa"/>
-          </w:tblCellMar>
-        </w:tblPrEx>
         <w:tc>
           <w:tcPr>
             <w:tcW w:w="2500" w:type="dxa"/>
@@ -3922,12 +3754,6 @@
         </w:tc>
       </w:tr>
       <w:tr>
-        <w:tblPrEx>
-          <w:tblCellMar>
-            <w:top w:w="0" w:type="dxa"/>
-            <w:bottom w:w="0" w:type="dxa"/>
-          </w:tblCellMar>
-        </w:tblPrEx>
         <w:tc>
           <w:tcPr>
             <w:tcW w:w="2500" w:type="dxa"/>
@@ -4140,12 +3966,6 @@
         </w:tc>
       </w:tr>
       <w:tr>
-        <w:tblPrEx>
-          <w:tblCellMar>
-            <w:top w:w="0" w:type="dxa"/>
-            <w:bottom w:w="0" w:type="dxa"/>
-          </w:tblCellMar>
-        </w:tblPrEx>
         <w:tc>
           <w:tcPr>
             <w:tcW w:w="2500" w:type="dxa"/>
@@ -4262,12 +4082,6 @@
         </w:tc>
       </w:tr>
       <w:tr>
-        <w:tblPrEx>
-          <w:tblCellMar>
-            <w:top w:w="0" w:type="dxa"/>
-            <w:bottom w:w="0" w:type="dxa"/>
-          </w:tblCellMar>
-        </w:tblPrEx>
         <w:tc>
           <w:tcPr>
             <w:tcW w:w="2500" w:type="dxa"/>
@@ -4412,12 +4226,6 @@
         <w:gridCol w:w="6860"/>
       </w:tblGrid>
       <w:tr>
-        <w:tblPrEx>
-          <w:tblCellMar>
-            <w:top w:w="0" w:type="dxa"/>
-            <w:bottom w:w="0" w:type="dxa"/>
-          </w:tblCellMar>
-        </w:tblPrEx>
         <w:tc>
           <w:tcPr>
             <w:tcW w:w="9360" w:type="dxa"/>
@@ -4452,12 +4260,6 @@
         </w:tc>
       </w:tr>
       <w:tr>
-        <w:tblPrEx>
-          <w:tblCellMar>
-            <w:top w:w="0" w:type="dxa"/>
-            <w:bottom w:w="0" w:type="dxa"/>
-          </w:tblCellMar>
-        </w:tblPrEx>
         <w:tc>
           <w:tcPr>
             <w:tcW w:w="2500" w:type="dxa"/>
@@ -4518,12 +4320,6 @@
         </w:tc>
       </w:tr>
       <w:tr>
-        <w:tblPrEx>
-          <w:tblCellMar>
-            <w:top w:w="0" w:type="dxa"/>
-            <w:bottom w:w="0" w:type="dxa"/>
-          </w:tblCellMar>
-        </w:tblPrEx>
         <w:tc>
           <w:tcPr>
             <w:tcW w:w="2500" w:type="dxa"/>
@@ -4584,12 +4380,6 @@
         </w:tc>
       </w:tr>
       <w:tr>
-        <w:tblPrEx>
-          <w:tblCellMar>
-            <w:top w:w="0" w:type="dxa"/>
-            <w:bottom w:w="0" w:type="dxa"/>
-          </w:tblCellMar>
-        </w:tblPrEx>
         <w:tc>
           <w:tcPr>
             <w:tcW w:w="2500" w:type="dxa"/>
@@ -4650,12 +4440,6 @@
         </w:tc>
       </w:tr>
       <w:tr>
-        <w:tblPrEx>
-          <w:tblCellMar>
-            <w:top w:w="0" w:type="dxa"/>
-            <w:bottom w:w="0" w:type="dxa"/>
-          </w:tblCellMar>
-        </w:tblPrEx>
         <w:tc>
           <w:tcPr>
             <w:tcW w:w="2500" w:type="dxa"/>
@@ -4716,12 +4500,6 @@
         </w:tc>
       </w:tr>
       <w:tr>
-        <w:tblPrEx>
-          <w:tblCellMar>
-            <w:top w:w="0" w:type="dxa"/>
-            <w:bottom w:w="0" w:type="dxa"/>
-          </w:tblCellMar>
-        </w:tblPrEx>
         <w:tc>
           <w:tcPr>
             <w:tcW w:w="2500" w:type="dxa"/>
@@ -4782,12 +4560,6 @@
         </w:tc>
       </w:tr>
       <w:tr>
-        <w:tblPrEx>
-          <w:tblCellMar>
-            <w:top w:w="0" w:type="dxa"/>
-            <w:bottom w:w="0" w:type="dxa"/>
-          </w:tblCellMar>
-        </w:tblPrEx>
         <w:tc>
           <w:tcPr>
             <w:tcW w:w="2500" w:type="dxa"/>
@@ -4848,12 +4620,6 @@
         </w:tc>
       </w:tr>
       <w:tr>
-        <w:tblPrEx>
-          <w:tblCellMar>
-            <w:top w:w="0" w:type="dxa"/>
-            <w:bottom w:w="0" w:type="dxa"/>
-          </w:tblCellMar>
-        </w:tblPrEx>
         <w:tc>
           <w:tcPr>
             <w:tcW w:w="2500" w:type="dxa"/>
@@ -5176,12 +4942,6 @@
         </w:tc>
       </w:tr>
       <w:tr>
-        <w:tblPrEx>
-          <w:tblCellMar>
-            <w:top w:w="0" w:type="dxa"/>
-            <w:bottom w:w="0" w:type="dxa"/>
-          </w:tblCellMar>
-        </w:tblPrEx>
         <w:tc>
           <w:tcPr>
             <w:tcW w:w="2500" w:type="dxa"/>
@@ -5316,12 +5076,6 @@
         </w:tc>
       </w:tr>
       <w:tr>
-        <w:tblPrEx>
-          <w:tblCellMar>
-            <w:top w:w="0" w:type="dxa"/>
-            <w:bottom w:w="0" w:type="dxa"/>
-          </w:tblCellMar>
-        </w:tblPrEx>
         <w:tc>
           <w:tcPr>
             <w:tcW w:w="2500" w:type="dxa"/>
@@ -5441,12 +5195,6 @@
         <w:gridCol w:w="6860"/>
       </w:tblGrid>
       <w:tr>
-        <w:tblPrEx>
-          <w:tblCellMar>
-            <w:top w:w="0" w:type="dxa"/>
-            <w:bottom w:w="0" w:type="dxa"/>
-          </w:tblCellMar>
-        </w:tblPrEx>
         <w:tc>
           <w:tcPr>
             <w:tcW w:w="9360" w:type="dxa"/>
@@ -5481,12 +5229,6 @@
         </w:tc>
       </w:tr>
       <w:tr>
-        <w:tblPrEx>
-          <w:tblCellMar>
-            <w:top w:w="0" w:type="dxa"/>
-            <w:bottom w:w="0" w:type="dxa"/>
-          </w:tblCellMar>
-        </w:tblPrEx>
         <w:tc>
           <w:tcPr>
             <w:tcW w:w="2500" w:type="dxa"/>
@@ -5547,12 +5289,6 @@
         </w:tc>
       </w:tr>
       <w:tr>
-        <w:tblPrEx>
-          <w:tblCellMar>
-            <w:top w:w="0" w:type="dxa"/>
-            <w:bottom w:w="0" w:type="dxa"/>
-          </w:tblCellMar>
-        </w:tblPrEx>
         <w:tc>
           <w:tcPr>
             <w:tcW w:w="2500" w:type="dxa"/>
@@ -5614,12 +5350,6 @@
         </w:tc>
       </w:tr>
       <w:tr>
-        <w:tblPrEx>
-          <w:tblCellMar>
-            <w:top w:w="0" w:type="dxa"/>
-            <w:bottom w:w="0" w:type="dxa"/>
-          </w:tblCellMar>
-        </w:tblPrEx>
         <w:tc>
           <w:tcPr>
             <w:tcW w:w="2500" w:type="dxa"/>
@@ -5680,12 +5410,6 @@
         </w:tc>
       </w:tr>
       <w:tr>
-        <w:tblPrEx>
-          <w:tblCellMar>
-            <w:top w:w="0" w:type="dxa"/>
-            <w:bottom w:w="0" w:type="dxa"/>
-          </w:tblCellMar>
-        </w:tblPrEx>
         <w:tc>
           <w:tcPr>
             <w:tcW w:w="2500" w:type="dxa"/>
@@ -5746,12 +5470,6 @@
         </w:tc>
       </w:tr>
       <w:tr>
-        <w:tblPrEx>
-          <w:tblCellMar>
-            <w:top w:w="0" w:type="dxa"/>
-            <w:bottom w:w="0" w:type="dxa"/>
-          </w:tblCellMar>
-        </w:tblPrEx>
         <w:tc>
           <w:tcPr>
             <w:tcW w:w="2500" w:type="dxa"/>
@@ -5812,12 +5530,6 @@
         </w:tc>
       </w:tr>
       <w:tr>
-        <w:tblPrEx>
-          <w:tblCellMar>
-            <w:top w:w="0" w:type="dxa"/>
-            <w:bottom w:w="0" w:type="dxa"/>
-          </w:tblCellMar>
-        </w:tblPrEx>
         <w:tc>
           <w:tcPr>
             <w:tcW w:w="2500" w:type="dxa"/>
@@ -5878,12 +5590,6 @@
         </w:tc>
       </w:tr>
       <w:tr>
-        <w:tblPrEx>
-          <w:tblCellMar>
-            <w:top w:w="0" w:type="dxa"/>
-            <w:bottom w:w="0" w:type="dxa"/>
-          </w:tblCellMar>
-        </w:tblPrEx>
         <w:tc>
           <w:tcPr>
             <w:tcW w:w="2500" w:type="dxa"/>
@@ -6253,12 +5959,6 @@
         </w:tc>
       </w:tr>
       <w:tr>
-        <w:tblPrEx>
-          <w:tblCellMar>
-            <w:top w:w="0" w:type="dxa"/>
-            <w:bottom w:w="0" w:type="dxa"/>
-          </w:tblCellMar>
-        </w:tblPrEx>
         <w:tc>
           <w:tcPr>
             <w:tcW w:w="2500" w:type="dxa"/>
@@ -6473,12 +6173,6 @@
         </w:tc>
       </w:tr>
       <w:tr>
-        <w:tblPrEx>
-          <w:tblCellMar>
-            <w:top w:w="0" w:type="dxa"/>
-            <w:bottom w:w="0" w:type="dxa"/>
-          </w:tblCellMar>
-        </w:tblPrEx>
         <w:tc>
           <w:tcPr>
             <w:tcW w:w="2500" w:type="dxa"/>
@@ -6566,12 +6260,6 @@
         <w:gridCol w:w="6860"/>
       </w:tblGrid>
       <w:tr>
-        <w:tblPrEx>
-          <w:tblCellMar>
-            <w:top w:w="0" w:type="dxa"/>
-            <w:bottom w:w="0" w:type="dxa"/>
-          </w:tblCellMar>
-        </w:tblPrEx>
         <w:tc>
           <w:tcPr>
             <w:tcW w:w="9360" w:type="dxa"/>
@@ -6606,12 +6294,6 @@
         </w:tc>
       </w:tr>
       <w:tr>
-        <w:tblPrEx>
-          <w:tblCellMar>
-            <w:top w:w="0" w:type="dxa"/>
-            <w:bottom w:w="0" w:type="dxa"/>
-          </w:tblCellMar>
-        </w:tblPrEx>
         <w:tc>
           <w:tcPr>
             <w:tcW w:w="2500" w:type="dxa"/>
@@ -6672,12 +6354,6 @@
         </w:tc>
       </w:tr>
       <w:tr>
-        <w:tblPrEx>
-          <w:tblCellMar>
-            <w:top w:w="0" w:type="dxa"/>
-            <w:bottom w:w="0" w:type="dxa"/>
-          </w:tblCellMar>
-        </w:tblPrEx>
         <w:tc>
           <w:tcPr>
             <w:tcW w:w="2500" w:type="dxa"/>
@@ -6738,12 +6414,6 @@
         </w:tc>
       </w:tr>
       <w:tr>
-        <w:tblPrEx>
-          <w:tblCellMar>
-            <w:top w:w="0" w:type="dxa"/>
-            <w:bottom w:w="0" w:type="dxa"/>
-          </w:tblCellMar>
-        </w:tblPrEx>
         <w:tc>
           <w:tcPr>
             <w:tcW w:w="2500" w:type="dxa"/>
@@ -6804,12 +6474,6 @@
         </w:tc>
       </w:tr>
       <w:tr>
-        <w:tblPrEx>
-          <w:tblCellMar>
-            <w:top w:w="0" w:type="dxa"/>
-            <w:bottom w:w="0" w:type="dxa"/>
-          </w:tblCellMar>
-        </w:tblPrEx>
         <w:tc>
           <w:tcPr>
             <w:tcW w:w="2500" w:type="dxa"/>
@@ -6870,12 +6534,6 @@
         </w:tc>
       </w:tr>
       <w:tr>
-        <w:tblPrEx>
-          <w:tblCellMar>
-            <w:top w:w="0" w:type="dxa"/>
-            <w:bottom w:w="0" w:type="dxa"/>
-          </w:tblCellMar>
-        </w:tblPrEx>
         <w:tc>
           <w:tcPr>
             <w:tcW w:w="2500" w:type="dxa"/>
@@ -6936,12 +6594,6 @@
         </w:tc>
       </w:tr>
       <w:tr>
-        <w:tblPrEx>
-          <w:tblCellMar>
-            <w:top w:w="0" w:type="dxa"/>
-            <w:bottom w:w="0" w:type="dxa"/>
-          </w:tblCellMar>
-        </w:tblPrEx>
         <w:tc>
           <w:tcPr>
             <w:tcW w:w="2500" w:type="dxa"/>
@@ -7019,12 +6671,6 @@
         </w:tc>
       </w:tr>
       <w:tr>
-        <w:tblPrEx>
-          <w:tblCellMar>
-            <w:top w:w="0" w:type="dxa"/>
-            <w:bottom w:w="0" w:type="dxa"/>
-          </w:tblCellMar>
-        </w:tblPrEx>
         <w:tc>
           <w:tcPr>
             <w:tcW w:w="2500" w:type="dxa"/>
@@ -7267,12 +6913,6 @@
         </w:tc>
       </w:tr>
       <w:tr>
-        <w:tblPrEx>
-          <w:tblCellMar>
-            <w:top w:w="0" w:type="dxa"/>
-            <w:bottom w:w="0" w:type="dxa"/>
-          </w:tblCellMar>
-        </w:tblPrEx>
         <w:tc>
           <w:tcPr>
             <w:tcW w:w="2500" w:type="dxa"/>
@@ -7421,12 +7061,6 @@
         </w:tc>
       </w:tr>
       <w:tr>
-        <w:tblPrEx>
-          <w:tblCellMar>
-            <w:top w:w="0" w:type="dxa"/>
-            <w:bottom w:w="0" w:type="dxa"/>
-          </w:tblCellMar>
-        </w:tblPrEx>
         <w:tc>
           <w:tcPr>
             <w:tcW w:w="2500" w:type="dxa"/>
@@ -7519,12 +7153,6 @@
         </w:tc>
       </w:tr>
       <w:tr>
-        <w:tblPrEx>
-          <w:tblCellMar>
-            <w:top w:w="0" w:type="dxa"/>
-            <w:bottom w:w="0" w:type="dxa"/>
-          </w:tblCellMar>
-        </w:tblPrEx>
         <w:tc>
           <w:tcPr>
             <w:tcW w:w="2500" w:type="dxa"/>
@@ -7668,6 +7296,9 @@
         <w:spacing w:before="80"/>
       </w:pPr>
       <w:r>
+        <w:rPr>
+          <w:noProof/>
+        </w:rPr>
         <w:drawing>
           <wp:inline distT="0" distB="0" distL="0" distR="0" wp14:anchorId="2E84D85A" wp14:editId="0309BDDC">
             <wp:extent cx="6400800" cy="2181225"/>
@@ -7761,6 +7392,7 @@
         <w:rPr>
           <w:i/>
           <w:iCs/>
+          <w:noProof/>
         </w:rPr>
         <w:drawing>
           <wp:inline distT="0" distB="0" distL="0" distR="0" wp14:anchorId="19300273" wp14:editId="67B34A86">
@@ -7843,6 +7475,7 @@
         <w:rPr>
           <w:i/>
           <w:iCs/>
+          <w:noProof/>
         </w:rPr>
         <w:lastRenderedPageBreak/>
         <w:drawing>
@@ -8034,12 +7667,6 @@
         <w:gridCol w:w="6192"/>
       </w:tblGrid>
       <w:tr>
-        <w:tblPrEx>
-          <w:tblCellMar>
-            <w:top w:w="0" w:type="dxa"/>
-            <w:bottom w:w="0" w:type="dxa"/>
-          </w:tblCellMar>
-        </w:tblPrEx>
         <w:tc>
           <w:tcPr>
             <w:tcW w:w="798" w:type="dxa"/>
@@ -8144,12 +7771,6 @@
         </w:tc>
       </w:tr>
       <w:tr>
-        <w:tblPrEx>
-          <w:tblCellMar>
-            <w:top w:w="0" w:type="dxa"/>
-            <w:bottom w:w="0" w:type="dxa"/>
-          </w:tblCellMar>
-        </w:tblPrEx>
         <w:tc>
           <w:tcPr>
             <w:tcW w:w="798" w:type="dxa"/>
@@ -8263,12 +7884,6 @@
         </w:tc>
       </w:tr>
       <w:tr>
-        <w:tblPrEx>
-          <w:tblCellMar>
-            <w:top w:w="0" w:type="dxa"/>
-            <w:bottom w:w="0" w:type="dxa"/>
-          </w:tblCellMar>
-        </w:tblPrEx>
         <w:tc>
           <w:tcPr>
             <w:tcW w:w="798" w:type="dxa"/>
@@ -8366,12 +7981,6 @@
         </w:tc>
       </w:tr>
       <w:tr>
-        <w:tblPrEx>
-          <w:tblCellMar>
-            <w:top w:w="0" w:type="dxa"/>
-            <w:bottom w:w="0" w:type="dxa"/>
-          </w:tblCellMar>
-        </w:tblPrEx>
         <w:tc>
           <w:tcPr>
             <w:tcW w:w="798" w:type="dxa"/>
@@ -8526,12 +8135,6 @@
         </w:tc>
       </w:tr>
       <w:tr>
-        <w:tblPrEx>
-          <w:tblCellMar>
-            <w:top w:w="0" w:type="dxa"/>
-            <w:bottom w:w="0" w:type="dxa"/>
-          </w:tblCellMar>
-        </w:tblPrEx>
         <w:tc>
           <w:tcPr>
             <w:tcW w:w="798" w:type="dxa"/>
@@ -8629,12 +8232,6 @@
         </w:tc>
       </w:tr>
       <w:tr>
-        <w:tblPrEx>
-          <w:tblCellMar>
-            <w:top w:w="0" w:type="dxa"/>
-            <w:bottom w:w="0" w:type="dxa"/>
-          </w:tblCellMar>
-        </w:tblPrEx>
         <w:tc>
           <w:tcPr>
             <w:tcW w:w="798" w:type="dxa"/>
@@ -8732,12 +8329,6 @@
         </w:tc>
       </w:tr>
       <w:tr>
-        <w:tblPrEx>
-          <w:tblCellMar>
-            <w:top w:w="0" w:type="dxa"/>
-            <w:bottom w:w="0" w:type="dxa"/>
-          </w:tblCellMar>
-        </w:tblPrEx>
         <w:tc>
           <w:tcPr>
             <w:tcW w:w="798" w:type="dxa"/>
@@ -8835,12 +8426,6 @@
         </w:tc>
       </w:tr>
       <w:tr>
-        <w:tblPrEx>
-          <w:tblCellMar>
-            <w:top w:w="0" w:type="dxa"/>
-            <w:bottom w:w="0" w:type="dxa"/>
-          </w:tblCellMar>
-        </w:tblPrEx>
         <w:tc>
           <w:tcPr>
             <w:tcW w:w="798" w:type="dxa"/>
@@ -9161,7 +8746,7 @@
         </w:rPr>
         <w:lastRenderedPageBreak/>
         <w:drawing>
-          <wp:inline distT="0" distB="0" distL="0" distR="0" wp14:anchorId="391AC5D1" wp14:editId="305674D8">
+          <wp:inline distT="0" distB="0" distL="0" distR="0" wp14:anchorId="391AC5D1" wp14:editId="7F820855">
             <wp:extent cx="6400800" cy="3703955"/>
             <wp:effectExtent l="0" t="0" r="0" b="0"/>
             <wp:docPr id="533701768" name="Picture 3"/>
@@ -9316,7 +8901,7 @@
         </w:rPr>
         <w:lastRenderedPageBreak/>
         <w:drawing>
-          <wp:inline distT="0" distB="0" distL="0" distR="0" wp14:anchorId="2F870B39" wp14:editId="51E74532">
+          <wp:inline distT="0" distB="0" distL="0" distR="0" wp14:anchorId="2F870B39" wp14:editId="378B8BE1">
             <wp:extent cx="6400800" cy="3093720"/>
             <wp:effectExtent l="0" t="0" r="0" b="0"/>
             <wp:docPr id="1919743656" name="Picture 5"/>
@@ -9379,6 +8964,9 @@
         <w:spacing w:before="160" w:after="160"/>
       </w:pPr>
       <w:r>
+        <w:rPr>
+          <w:noProof/>
+        </w:rPr>
         <w:drawing>
           <wp:inline distT="0" distB="0" distL="0" distR="0" wp14:anchorId="31E91F9B" wp14:editId="166F9657">
             <wp:extent cx="6400800" cy="3101975"/>
@@ -10137,6 +9725,7 @@
   <w:style w:type="character" w:default="1" w:styleId="DefaultParagraphFont">
     <w:name w:val="Default Paragraph Font"/>
     <w:uiPriority w:val="1"/>
+    <w:semiHidden/>
     <w:unhideWhenUsed/>
   </w:style>
   <w:style w:type="table" w:default="1" w:styleId="TableNormal">

</xml_diff>